<commit_message>
Manual tecnico v2.0 y propuesta ajustada tras la prueba en iPad
</commit_message>
<xml_diff>
--- a/documentos/Propuesta-mejoras-AulaFacil.docx
+++ b/documentos/Propuesta-mejoras-AulaFacil.docx
@@ -82,7 +82,7 @@
           <w:sz w:val="20"/>
           <w:szCs w:val="20"/>
         </w:rPr>
-        <w:t xml:space="preserve">Versión 1.0 · Septiembre 2026</w:t>
+        <w:t xml:space="preserve">Versión 1.1 · Septiembre 2026</w:t>
       </w:r>
     </w:p>
     <w:p>
@@ -155,6 +155,72 @@
     </w:p>
     <w:p>
       <w:pPr>
+        <w:pStyle w:val="Heading2"/>
+        <w:spacing w:after="120" w:before="260"/>
+      </w:pPr>
+      <w:r>
+        <w:rPr>
+          <w:rFonts w:ascii="Calibri" w:cs="Calibri" w:eastAsia="Calibri" w:hAnsi="Calibri"/>
+          <w:b/>
+          <w:bCs/>
+          <w:color w:val="3A3B3E"/>
+          <w:sz w:val="26"/>
+          <w:szCs w:val="26"/>
+        </w:rPr>
+        <w:t xml:space="preserve">Ya resuelto, sin costo</w:t>
+      </w:r>
+    </w:p>
+    <w:p>
+      <w:pPr>
+        <w:spacing w:after="120" w:line="276"/>
+      </w:pPr>
+      <w:r>
+        <w:rPr>
+          <w:rFonts w:ascii="Calibri" w:cs="Calibri" w:eastAsia="Calibri" w:hAnsi="Calibri"/>
+          <w:sz w:val="22"/>
+          <w:szCs w:val="22"/>
+        </w:rPr>
+        <w:t xml:space="preserve">Dos puntos que figuraban en la versión anterior de esta propuesta quedaron atendidos y salen del alcance:</w:t>
+      </w:r>
+    </w:p>
+    <w:p>
+      <w:pPr>
+        <w:pStyle w:val="ListParagraph"/>
+        <w:numPr>
+          <w:ilvl w:val="0"/>
+          <w:numId w:val="2"/>
+        </w:numPr>
+        <w:spacing w:after="70"/>
+      </w:pPr>
+      <w:r>
+        <w:rPr>
+          <w:rFonts w:ascii="Calibri" w:cs="Calibri" w:eastAsia="Calibri" w:hAnsi="Calibri"/>
+          <w:sz w:val="22"/>
+          <w:szCs w:val="22"/>
+        </w:rPr>
+        <w:t xml:space="preserve">Manual técnico actualizado a la versión 2.0, con las funciones de servidor, las 32 migraciones, el flujo del pase de entrada y los riesgos operativos detectados en campo.</w:t>
+      </w:r>
+    </w:p>
+    <w:p>
+      <w:pPr>
+        <w:pStyle w:val="ListParagraph"/>
+        <w:numPr>
+          <w:ilvl w:val="0"/>
+          <w:numId w:val="2"/>
+        </w:numPr>
+        <w:spacing w:after="70"/>
+      </w:pPr>
+      <w:r>
+        <w:rPr>
+          <w:rFonts w:ascii="Calibri" w:cs="Calibri" w:eastAsia="Calibri" w:hAnsi="Calibri"/>
+          <w:sz w:val="22"/>
+          <w:szCs w:val="22"/>
+        </w:rPr>
+        <w:t xml:space="preserve">Comportamiento del teclado en tablet durante los exámenes: corregido y verificado en iPad el 28 de septiembre, con un examen de cuatro preguntas abiertas y sin una sola advertencia registrada.</w:t>
+      </w:r>
+    </w:p>
+    <w:p>
+      <w:pPr>
         <w:pStyle w:val="Heading1"/>
         <w:spacing w:after="160" w:before="360"/>
       </w:pPr>
@@ -196,7 +262,7 @@
           <w:sz w:val="23"/>
           <w:szCs w:val="23"/>
         </w:rPr>
-        <w:t xml:space="preserve">Manual técnico actualizado</w:t>
+        <w:t xml:space="preserve">Aviso de privacidad y registro de tratamiento de datos</w:t>
       </w:r>
     </w:p>
     <w:p>
@@ -209,7 +275,7 @@
           <w:sz w:val="22"/>
           <w:szCs w:val="22"/>
         </w:rPr>
-        <w:t xml:space="preserve">El manual técnico quedó en la versión anterior del sistema: no documenta las funciones de servidor que se agregaron, las migraciones nuevas ni el flujo del código de entrada. Es el documento que va a leer quien dé mantenimiento después. Sin él, la primera falla se convierte en una investigación desde cero.</w:t>
+        <w:t xml:space="preserve">El sistema guarda nombre, matrícula, asistencia y calificaciones de menores de edad. La legislación mexicana exige un aviso de privacidad y dejar constancia de cómo se tratan esos datos. Hoy no existe ese documento. Es el punto que más expone a la institución.</w:t>
       </w:r>
     </w:p>
     <w:p>
@@ -224,7 +290,7 @@
           <w:sz w:val="22"/>
           <w:szCs w:val="22"/>
         </w:rPr>
-        <w:t xml:space="preserve">6 horas · $2,700 M.N.</w:t>
+        <w:t xml:space="preserve">5 horas · $2,250 M.N.</w:t>
       </w:r>
     </w:p>
     <w:p>
@@ -240,7 +306,7 @@
           <w:sz w:val="23"/>
           <w:szCs w:val="23"/>
         </w:rPr>
-        <w:t xml:space="preserve">Aviso de privacidad y registro de tratamiento de datos</w:t>
+        <w:t xml:space="preserve">Correo propio para el registro de maestros</w:t>
       </w:r>
     </w:p>
     <w:p>
@@ -253,95 +319,7 @@
           <w:sz w:val="22"/>
           <w:szCs w:val="22"/>
         </w:rPr>
-        <w:t xml:space="preserve">El sistema guarda nombre, matrícula, asistencia y calificaciones de menores de edad. La legislación mexicana exige un aviso de privacidad y dejar constancia de cómo se tratan esos datos. Hoy no existe ese documento. Es el punto que más expone a la institución.</w:t>
-      </w:r>
-    </w:p>
-    <w:p>
-      <w:pPr>
-        <w:spacing w:after="120"/>
-      </w:pPr>
-      <w:r>
-        <w:rPr>
-          <w:rFonts w:ascii="Calibri" w:cs="Calibri" w:eastAsia="Calibri" w:hAnsi="Calibri"/>
-          <w:b/>
-          <w:bCs/>
-          <w:sz w:val="22"/>
-          <w:szCs w:val="22"/>
-        </w:rPr>
-        <w:t xml:space="preserve">5 horas · $2,250 M.N.</w:t>
-      </w:r>
-    </w:p>
-    <w:p>
-      <w:pPr>
-        <w:spacing w:after="60" w:before="220"/>
-      </w:pPr>
-      <w:r>
-        <w:rPr>
-          <w:rFonts w:ascii="Calibri" w:cs="Calibri" w:eastAsia="Calibri" w:hAnsi="Calibri"/>
-          <w:b/>
-          <w:bCs/>
-          <w:color w:val="3A3B3E"/>
-          <w:sz w:val="23"/>
-          <w:szCs w:val="23"/>
-        </w:rPr>
-        <w:t xml:space="preserve">Correo propio para el registro de maestros</w:t>
-      </w:r>
-    </w:p>
-    <w:p>
-      <w:pPr>
-        <w:spacing w:after="120" w:line="276"/>
-      </w:pPr>
-      <w:r>
-        <w:rPr>
-          <w:rFonts w:ascii="Calibri" w:cs="Calibri" w:eastAsia="Calibri" w:hAnsi="Calibri"/>
-          <w:sz w:val="22"/>
-          <w:szCs w:val="22"/>
-        </w:rPr>
         <w:t xml:space="preserve">El servicio de correo que se usa hoy entrega un máximo de dos mensajes por hora. Con los maestros que se han ido sumando, el día que dos se registren juntos el segundo no recibe su correo de confirmación, sin ningún aviso de por qué. Se resuelve conectando un servicio de correo propio y el límite sube a treinta por hora.</w:t>
-      </w:r>
-    </w:p>
-    <w:p>
-      <w:pPr>
-        <w:spacing w:after="120"/>
-      </w:pPr>
-      <w:r>
-        <w:rPr>
-          <w:rFonts w:ascii="Calibri" w:cs="Calibri" w:eastAsia="Calibri" w:hAnsi="Calibri"/>
-          <w:b/>
-          <w:bCs/>
-          <w:sz w:val="22"/>
-          <w:szCs w:val="22"/>
-        </w:rPr>
-        <w:t xml:space="preserve">4 horas · $1,800 M.N.</w:t>
-      </w:r>
-    </w:p>
-    <w:p>
-      <w:pPr>
-        <w:spacing w:after="60" w:before="220"/>
-      </w:pPr>
-      <w:r>
-        <w:rPr>
-          <w:rFonts w:ascii="Calibri" w:cs="Calibri" w:eastAsia="Calibri" w:hAnsi="Calibri"/>
-          <w:b/>
-          <w:bCs/>
-          <w:color w:val="3A3B3E"/>
-          <w:sz w:val="23"/>
-          <w:szCs w:val="23"/>
-        </w:rPr>
-        <w:t xml:space="preserve">Cierre de la revisión en tablet</w:t>
-      </w:r>
-    </w:p>
-    <w:p>
-      <w:pPr>
-        <w:spacing w:after="120" w:line="276"/>
-      </w:pPr>
-      <w:r>
-        <w:rPr>
-          <w:rFonts w:ascii="Calibri" w:cs="Calibri" w:eastAsia="Calibri" w:hAnsi="Calibri"/>
-          <w:sz w:val="22"/>
-          <w:szCs w:val="22"/>
-        </w:rPr>
-        <w:t xml:space="preserve">Queda una revisión pendiente del comportamiento del teclado en iPad durante los exámenes. Incluye la prueba en el aparato y la corrección que resulte.</w:t>
       </w:r>
     </w:p>
     <w:p>
@@ -505,7 +483,7 @@
                 <w:sz w:val="20"/>
                 <w:szCs w:val="20"/>
               </w:rPr>
-              <w:t xml:space="preserve">Manual técnico actualizado</w:t>
+              <w:t xml:space="preserve">Aviso de privacidad y registro de tratamiento</w:t>
             </w:r>
           </w:p>
         </w:tc>
@@ -531,7 +509,7 @@
                 <w:sz w:val="20"/>
                 <w:szCs w:val="20"/>
               </w:rPr>
-              <w:t xml:space="preserve">6</w:t>
+              <w:t xml:space="preserve">5</w:t>
             </w:r>
           </w:p>
         </w:tc>
@@ -557,7 +535,7 @@
                 <w:sz w:val="20"/>
                 <w:szCs w:val="20"/>
               </w:rPr>
-              <w:t xml:space="preserve">$2,700</w:t>
+              <w:t xml:space="preserve">$2,250</w:t>
             </w:r>
           </w:p>
         </w:tc>
@@ -586,7 +564,7 @@
                 <w:sz w:val="20"/>
                 <w:szCs w:val="20"/>
               </w:rPr>
-              <w:t xml:space="preserve">Aviso de privacidad y registro de tratamiento</w:t>
+              <w:t xml:space="preserve">Correo propio para el registro de maestros</w:t>
             </w:r>
           </w:p>
         </w:tc>
@@ -613,7 +591,7 @@
                 <w:sz w:val="20"/>
                 <w:szCs w:val="20"/>
               </w:rPr>
-              <w:t xml:space="preserve">5</w:t>
+              <w:t xml:space="preserve">4</w:t>
             </w:r>
           </w:p>
         </w:tc>
@@ -640,7 +618,7 @@
                 <w:sz w:val="20"/>
                 <w:szCs w:val="20"/>
               </w:rPr>
-              <w:t xml:space="preserve">$2,250</w:t>
+              <w:t xml:space="preserve">$1,800</w:t>
             </w:r>
           </w:p>
         </w:tc>
@@ -668,7 +646,7 @@
                 <w:sz w:val="20"/>
                 <w:szCs w:val="20"/>
               </w:rPr>
-              <w:t xml:space="preserve">Correo propio para el registro de maestros</w:t>
+              <w:t xml:space="preserve">SUBTOTAL</w:t>
             </w:r>
           </w:p>
         </w:tc>
@@ -694,7 +672,7 @@
                 <w:sz w:val="20"/>
                 <w:szCs w:val="20"/>
               </w:rPr>
-              <w:t xml:space="preserve">4</w:t>
+              <w:t xml:space="preserve">9</w:t>
             </w:r>
           </w:p>
         </w:tc>
@@ -720,170 +698,7 @@
                 <w:sz w:val="20"/>
                 <w:szCs w:val="20"/>
               </w:rPr>
-              <w:t xml:space="preserve">$1,800</w:t>
-            </w:r>
-          </w:p>
-        </w:tc>
-      </w:tr>
-      <w:tr>
-        <w:tc>
-          <w:tcPr>
-            <w:tcW w:type="dxa" w:w="5760"/>
-            <w:shd w:fill="F2F2F5" w:val="clear"/>
-            <w:tcMar>
-              <w:top w:type="dxa" w:w="70"/>
-              <w:left w:type="dxa" w:w="110"/>
-              <w:bottom w:type="dxa" w:w="70"/>
-              <w:right w:type="dxa" w:w="110"/>
-            </w:tcMar>
-          </w:tcPr>
-          <w:p>
-            <w:pPr>
-              <w:spacing w:after="0"/>
-            </w:pPr>
-            <w:r>
-              <w:rPr>
-                <w:rFonts w:ascii="Calibri" w:cs="Calibri" w:eastAsia="Calibri" w:hAnsi="Calibri"/>
-                <w:b w:val="false"/>
-                <w:bCs w:val="false"/>
-                <w:sz w:val="20"/>
-                <w:szCs w:val="20"/>
-              </w:rPr>
-              <w:t xml:space="preserve">Cierre de la revisión en tablet</w:t>
-            </w:r>
-          </w:p>
-        </w:tc>
-        <w:tc>
-          <w:tcPr>
-            <w:tcW w:type="dxa" w:w="1400"/>
-            <w:shd w:fill="F2F2F5" w:val="clear"/>
-            <w:tcMar>
-              <w:top w:type="dxa" w:w="70"/>
-              <w:left w:type="dxa" w:w="110"/>
-              <w:bottom w:type="dxa" w:w="70"/>
-              <w:right w:type="dxa" w:w="110"/>
-            </w:tcMar>
-          </w:tcPr>
-          <w:p>
-            <w:pPr>
-              <w:spacing w:after="0"/>
-            </w:pPr>
-            <w:r>
-              <w:rPr>
-                <w:rFonts w:ascii="Calibri" w:cs="Calibri" w:eastAsia="Calibri" w:hAnsi="Calibri"/>
-                <w:b w:val="false"/>
-                <w:bCs w:val="false"/>
-                <w:sz w:val="20"/>
-                <w:szCs w:val="20"/>
-              </w:rPr>
-              <w:t xml:space="preserve">4</w:t>
-            </w:r>
-          </w:p>
-        </w:tc>
-        <w:tc>
-          <w:tcPr>
-            <w:tcW w:type="dxa" w:w="2200"/>
-            <w:shd w:fill="F2F2F5" w:val="clear"/>
-            <w:tcMar>
-              <w:top w:type="dxa" w:w="70"/>
-              <w:left w:type="dxa" w:w="110"/>
-              <w:bottom w:type="dxa" w:w="70"/>
-              <w:right w:type="dxa" w:w="110"/>
-            </w:tcMar>
-          </w:tcPr>
-          <w:p>
-            <w:pPr>
-              <w:spacing w:after="0"/>
-            </w:pPr>
-            <w:r>
-              <w:rPr>
-                <w:rFonts w:ascii="Calibri" w:cs="Calibri" w:eastAsia="Calibri" w:hAnsi="Calibri"/>
-                <w:b w:val="false"/>
-                <w:bCs w:val="false"/>
-                <w:sz w:val="20"/>
-                <w:szCs w:val="20"/>
-              </w:rPr>
-              <w:t xml:space="preserve">$1,800</w:t>
-            </w:r>
-          </w:p>
-        </w:tc>
-      </w:tr>
-      <w:tr>
-        <w:tc>
-          <w:tcPr>
-            <w:tcW w:type="dxa" w:w="5760"/>
-            <w:tcMar>
-              <w:top w:type="dxa" w:w="70"/>
-              <w:left w:type="dxa" w:w="110"/>
-              <w:bottom w:type="dxa" w:w="70"/>
-              <w:right w:type="dxa" w:w="110"/>
-            </w:tcMar>
-          </w:tcPr>
-          <w:p>
-            <w:pPr>
-              <w:spacing w:after="0"/>
-            </w:pPr>
-            <w:r>
-              <w:rPr>
-                <w:rFonts w:ascii="Calibri" w:cs="Calibri" w:eastAsia="Calibri" w:hAnsi="Calibri"/>
-                <w:b w:val="false"/>
-                <w:bCs w:val="false"/>
-                <w:sz w:val="20"/>
-                <w:szCs w:val="20"/>
-              </w:rPr>
-              <w:t xml:space="preserve">SUBTOTAL</w:t>
-            </w:r>
-          </w:p>
-        </w:tc>
-        <w:tc>
-          <w:tcPr>
-            <w:tcW w:type="dxa" w:w="1400"/>
-            <w:tcMar>
-              <w:top w:type="dxa" w:w="70"/>
-              <w:left w:type="dxa" w:w="110"/>
-              <w:bottom w:type="dxa" w:w="70"/>
-              <w:right w:type="dxa" w:w="110"/>
-            </w:tcMar>
-          </w:tcPr>
-          <w:p>
-            <w:pPr>
-              <w:spacing w:after="0"/>
-            </w:pPr>
-            <w:r>
-              <w:rPr>
-                <w:rFonts w:ascii="Calibri" w:cs="Calibri" w:eastAsia="Calibri" w:hAnsi="Calibri"/>
-                <w:b w:val="false"/>
-                <w:bCs w:val="false"/>
-                <w:sz w:val="20"/>
-                <w:szCs w:val="20"/>
-              </w:rPr>
-              <w:t xml:space="preserve">19</w:t>
-            </w:r>
-          </w:p>
-        </w:tc>
-        <w:tc>
-          <w:tcPr>
-            <w:tcW w:type="dxa" w:w="2200"/>
-            <w:tcMar>
-              <w:top w:type="dxa" w:w="70"/>
-              <w:left w:type="dxa" w:w="110"/>
-              <w:bottom w:type="dxa" w:w="70"/>
-              <w:right w:type="dxa" w:w="110"/>
-            </w:tcMar>
-          </w:tcPr>
-          <w:p>
-            <w:pPr>
-              <w:spacing w:after="0"/>
-            </w:pPr>
-            <w:r>
-              <w:rPr>
-                <w:rFonts w:ascii="Calibri" w:cs="Calibri" w:eastAsia="Calibri" w:hAnsi="Calibri"/>
-                <w:b w:val="false"/>
-                <w:bCs w:val="false"/>
-                <w:sz w:val="20"/>
-                <w:szCs w:val="20"/>
-              </w:rPr>
-              <w:t xml:space="preserve">$8,550</w:t>
+              <w:t xml:space="preserve">$4,050</w:t>
             </w:r>
           </w:p>
         </w:tc>
@@ -1871,7 +1686,7 @@
                 <w:sz w:val="20"/>
                 <w:szCs w:val="20"/>
               </w:rPr>
-              <w:t xml:space="preserve">19</w:t>
+              <w:t xml:space="preserve">9</w:t>
             </w:r>
           </w:p>
         </w:tc>
@@ -1897,7 +1712,7 @@
                 <w:sz w:val="20"/>
                 <w:szCs w:val="20"/>
               </w:rPr>
-              <w:t xml:space="preserve">$8,550</w:t>
+              <w:t xml:space="preserve">$4,050</w:t>
             </w:r>
           </w:p>
         </w:tc>
@@ -2116,7 +1931,7 @@
                 <w:sz w:val="20"/>
                 <w:szCs w:val="20"/>
               </w:rPr>
-              <w:t xml:space="preserve">58</w:t>
+              <w:t xml:space="preserve">48</w:t>
             </w:r>
           </w:p>
         </w:tc>
@@ -2143,7 +1958,7 @@
                 <w:sz w:val="20"/>
                 <w:szCs w:val="20"/>
               </w:rPr>
-              <w:t xml:space="preserve">$26,100</w:t>
+              <w:t xml:space="preserve">$21,600</w:t>
             </w:r>
           </w:p>
         </w:tc>
@@ -2440,6 +2255,12 @@
   </w:abstractNum>
   <w:num w:numId="1">
     <w:abstractNumId w:val="1"/>
+    <w:lvlOverride w:ilvl="0">
+      <w:startOverride w:val="1"/>
+    </w:lvlOverride>
+  </w:num>
+  <w:num w:numId="2">
+    <w:abstractNumId w:val="2"/>
     <w:lvlOverride w:ilvl="0">
       <w:startOverride w:val="1"/>
     </w:lvlOverride>

</xml_diff>